<commit_message>
Worked on and finished multiple merges.
</commit_message>
<xml_diff>
--- a/project/documents/formaldocuments/BSCCombinedAssnDec.docx
+++ b/project/documents/formaldocuments/BSCCombinedAssnDec.docx
@@ -194,8 +194,13 @@
         </w:rPr>
         <w:fldChar w:fldCharType="end"/>
       </w:r>
-      <w:r>
-        <w:t xml:space="preserve">WHEREAS, </w:t>
+      <w:proofErr w:type="gramStart"/>
+      <w:r>
+        <w:t>WHEREAS,</w:t>
+      </w:r>
+      <w:proofErr w:type="gramEnd"/>
+      <w:r>
+        <w:t xml:space="preserve"> </w:t>
       </w:r>
       <w:r>
         <w:t>I,</w:t>
@@ -755,7 +760,15 @@
         <w:t>)</w:t>
       </w:r>
       <w:r>
-        <w:t xml:space="preserve"> in its own name if desired, in any and all countries.</w:t>
+        <w:t xml:space="preserve"> in its own name if desired, in </w:t>
+      </w:r>
+      <w:proofErr w:type="gramStart"/>
+      <w:r>
+        <w:t>any and all</w:t>
+      </w:r>
+      <w:proofErr w:type="gramEnd"/>
+      <w:r>
+        <w:t xml:space="preserve"> countries.</w:t>
       </w:r>
     </w:p>
     <w:p>
@@ -1058,191 +1071,6 @@
         <w:t>.</w:t>
       </w:r>
     </w:p>
-    <w:tbl>
-      <w:tblPr>
-        <w:tblW w:w="0" w:type="auto"/>
-        <w:tblCellSpacing w:w="7" w:type="dxa"/>
-        <w:tblCellMar>
-          <w:left w:w="115" w:type="dxa"/>
-          <w:right w:w="115" w:type="dxa"/>
-        </w:tblCellMar>
-        <w:tblLook w:val="04A0" w:firstRow="1" w:lastRow="0" w:firstColumn="1" w:lastColumn="0" w:noHBand="0" w:noVBand="1"/>
-      </w:tblPr>
-      <w:tblGrid>
-        <w:gridCol w:w="4809"/>
-        <w:gridCol w:w="4809"/>
-      </w:tblGrid>
-      <w:tr>
-        <w:trPr>
-          <w:cantSplit/>
-          <w:trHeight w:val="1046"/>
-          <w:tblCellSpacing w:w="7" w:type="dxa"/>
-        </w:trPr>
-        <w:tc>
-          <w:tcPr>
-            <w:tcW w:w="4788" w:type="dxa"/>
-            <w:shd w:val="clear" w:color="auto" w:fill="auto"/>
-          </w:tcPr>
-          <w:p>
-            <w:pPr>
-              <w:pStyle w:val="BodyTextFirst5"/>
-              <w:spacing w:after="0"/>
-              <w:ind w:firstLine="0"/>
-            </w:pPr>
-          </w:p>
-          <w:p>
-            <w:pPr>
-              <w:pStyle w:val="BodyTextFirst5"/>
-              <w:spacing w:after="0"/>
-              <w:ind w:firstLine="0"/>
-            </w:pPr>
-            <w:r>
-              <w:t>/</w:t>
-            </w:r>
-            <w:r>
-              <w:t>________________________________________</w:t>
-            </w:r>
-            <w:r>
-              <w:t>/</w:t>
-            </w:r>
-          </w:p>
-          <w:p>
-            <w:pPr>
-              <w:pStyle w:val="BodyTextFirst5"/>
-              <w:spacing w:after="0"/>
-              <w:ind w:firstLine="0"/>
-            </w:pPr>
-            <w:r>
-              <w:t>&lt;&lt;Inventor1&gt;&gt;</w:t>
-            </w:r>
-          </w:p>
-          <w:p>
-            <w:pPr>
-              <w:pStyle w:val="BodyTextFirst5"/>
-              <w:spacing w:after="0"/>
-              <w:ind w:firstLine="0"/>
-              <w:rPr>
-                <w:b/>
-              </w:rPr>
-            </w:pPr>
-          </w:p>
-          <w:p>
-            <w:pPr>
-              <w:pStyle w:val="BodyTextFirst5"/>
-              <w:spacing w:after="0"/>
-              <w:ind w:firstLine="0"/>
-              <w:rPr>
-                <w:u w:val="single"/>
-              </w:rPr>
-            </w:pPr>
-            <w:r>
-              <w:t xml:space="preserve">Date </w:t>
-            </w:r>
-            <w:r>
-              <w:rPr>
-                <w:u w:val="single"/>
-              </w:rPr>
-              <w:t>  </w:t>
-            </w:r>
-            <w:r>
-              <w:rPr>
-                <w:u w:val="single"/>
-              </w:rPr>
-              <w:tab/>
-            </w:r>
-            <w:r>
-              <w:rPr>
-                <w:u w:val="single"/>
-              </w:rPr>
-              <w:tab/>
-              <w:t>  </w:t>
-            </w:r>
-          </w:p>
-        </w:tc>
-        <w:tc>
-          <w:tcPr>
-            <w:tcW w:w="4788" w:type="dxa"/>
-            <w:shd w:val="clear" w:color="auto" w:fill="auto"/>
-          </w:tcPr>
-          <w:p>
-            <w:pPr>
-              <w:pStyle w:val="BodyTextFirst5"/>
-              <w:spacing w:after="0"/>
-              <w:ind w:firstLine="0"/>
-            </w:pPr>
-          </w:p>
-          <w:p>
-            <w:pPr>
-              <w:pStyle w:val="BodyTextFirst5"/>
-              <w:spacing w:after="0"/>
-              <w:ind w:firstLine="0"/>
-            </w:pPr>
-            <w:r>
-              <w:t>/</w:t>
-            </w:r>
-            <w:r>
-              <w:t>_________________________________________</w:t>
-            </w:r>
-            <w:r>
-              <w:t>/</w:t>
-            </w:r>
-          </w:p>
-          <w:p>
-            <w:pPr>
-              <w:pStyle w:val="BodyTextFirst5"/>
-              <w:spacing w:after="0"/>
-              <w:ind w:firstLine="0"/>
-            </w:pPr>
-            <w:r>
-              <w:t>&lt;&lt;Inventor2&gt;&gt;</w:t>
-            </w:r>
-          </w:p>
-          <w:p>
-            <w:pPr>
-              <w:pStyle w:val="BodyTextFirst5"/>
-              <w:spacing w:after="0"/>
-              <w:ind w:firstLine="0"/>
-              <w:rPr>
-                <w:b/>
-              </w:rPr>
-            </w:pPr>
-          </w:p>
-          <w:p>
-            <w:pPr>
-              <w:pStyle w:val="BodyTextFirst5"/>
-              <w:spacing w:after="0"/>
-              <w:ind w:firstLine="0"/>
-              <w:rPr>
-                <w:u w:val="single"/>
-              </w:rPr>
-            </w:pPr>
-            <w:r>
-              <w:t xml:space="preserve">Date </w:t>
-            </w:r>
-            <w:r>
-              <w:rPr>
-                <w:u w:val="single"/>
-              </w:rPr>
-              <w:t>  </w:t>
-            </w:r>
-            <w:r>
-              <w:rPr>
-                <w:u w:val="single"/>
-              </w:rPr>
-              <w:tab/>
-            </w:r>
-            <w:r>
-              <w:rPr>
-                <w:u w:val="single"/>
-              </w:rPr>
-              <w:tab/>
-              <w:t>  </w:t>
-            </w:r>
-          </w:p>
-        </w:tc>
-      </w:tr>
-    </w:tbl>
-    <w:p/>
     <w:sectPr>
       <w:headerReference w:type="default" r:id="rId7"/>
       <w:footerReference w:type="default" r:id="rId8"/>
@@ -2390,6 +2218,50 @@
     <w:lsdException w:name="Subtitle" w:qFormat="1"/>
     <w:lsdException w:name="Strong" w:qFormat="1"/>
     <w:lsdException w:name="Emphasis" w:qFormat="1"/>
+    <w:lsdException w:name="Normal Table" w:semiHidden="1" w:unhideWhenUsed="1"/>
+    <w:lsdException w:name="Table Simple 1" w:semiHidden="1" w:unhideWhenUsed="1"/>
+    <w:lsdException w:name="Table Simple 2" w:semiHidden="1" w:unhideWhenUsed="1"/>
+    <w:lsdException w:name="Table Simple 3" w:semiHidden="1" w:unhideWhenUsed="1"/>
+    <w:lsdException w:name="Table Classic 1" w:semiHidden="1" w:unhideWhenUsed="1"/>
+    <w:lsdException w:name="Table Classic 2" w:semiHidden="1" w:unhideWhenUsed="1"/>
+    <w:lsdException w:name="Table Classic 3" w:semiHidden="1" w:unhideWhenUsed="1"/>
+    <w:lsdException w:name="Table Classic 4" w:semiHidden="1" w:unhideWhenUsed="1"/>
+    <w:lsdException w:name="Table Colorful 1" w:semiHidden="1" w:unhideWhenUsed="1"/>
+    <w:lsdException w:name="Table Colorful 2" w:semiHidden="1" w:unhideWhenUsed="1"/>
+    <w:lsdException w:name="Table Colorful 3" w:semiHidden="1" w:unhideWhenUsed="1"/>
+    <w:lsdException w:name="Table Columns 1" w:semiHidden="1" w:unhideWhenUsed="1"/>
+    <w:lsdException w:name="Table Columns 2" w:semiHidden="1" w:unhideWhenUsed="1"/>
+    <w:lsdException w:name="Table Columns 3" w:semiHidden="1" w:unhideWhenUsed="1"/>
+    <w:lsdException w:name="Table Columns 4" w:semiHidden="1" w:unhideWhenUsed="1"/>
+    <w:lsdException w:name="Table Columns 5" w:semiHidden="1" w:unhideWhenUsed="1"/>
+    <w:lsdException w:name="Table Grid 1" w:semiHidden="1" w:unhideWhenUsed="1"/>
+    <w:lsdException w:name="Table Grid 2" w:semiHidden="1" w:unhideWhenUsed="1"/>
+    <w:lsdException w:name="Table Grid 3" w:semiHidden="1" w:unhideWhenUsed="1"/>
+    <w:lsdException w:name="Table Grid 4" w:semiHidden="1" w:unhideWhenUsed="1"/>
+    <w:lsdException w:name="Table Grid 5" w:semiHidden="1" w:unhideWhenUsed="1"/>
+    <w:lsdException w:name="Table Grid 6" w:semiHidden="1" w:unhideWhenUsed="1"/>
+    <w:lsdException w:name="Table Grid 7" w:semiHidden="1" w:unhideWhenUsed="1"/>
+    <w:lsdException w:name="Table Grid 8" w:semiHidden="1" w:unhideWhenUsed="1"/>
+    <w:lsdException w:name="Table List 1" w:semiHidden="1" w:unhideWhenUsed="1"/>
+    <w:lsdException w:name="Table List 2" w:semiHidden="1" w:unhideWhenUsed="1"/>
+    <w:lsdException w:name="Table List 3" w:semiHidden="1" w:unhideWhenUsed="1"/>
+    <w:lsdException w:name="Table List 4" w:semiHidden="1" w:unhideWhenUsed="1"/>
+    <w:lsdException w:name="Table List 5" w:semiHidden="1" w:unhideWhenUsed="1"/>
+    <w:lsdException w:name="Table List 6" w:semiHidden="1" w:unhideWhenUsed="1"/>
+    <w:lsdException w:name="Table List 7" w:semiHidden="1" w:unhideWhenUsed="1"/>
+    <w:lsdException w:name="Table List 8" w:semiHidden="1" w:unhideWhenUsed="1"/>
+    <w:lsdException w:name="Table 3D effects 1" w:semiHidden="1" w:unhideWhenUsed="1"/>
+    <w:lsdException w:name="Table 3D effects 2" w:semiHidden="1" w:unhideWhenUsed="1"/>
+    <w:lsdException w:name="Table 3D effects 3" w:semiHidden="1" w:unhideWhenUsed="1"/>
+    <w:lsdException w:name="Table Contemporary" w:semiHidden="1" w:unhideWhenUsed="1"/>
+    <w:lsdException w:name="Table Elegant" w:semiHidden="1" w:unhideWhenUsed="1"/>
+    <w:lsdException w:name="Table Professional" w:semiHidden="1" w:unhideWhenUsed="1"/>
+    <w:lsdException w:name="Table Subtle 1" w:semiHidden="1" w:unhideWhenUsed="1"/>
+    <w:lsdException w:name="Table Subtle 2" w:semiHidden="1" w:unhideWhenUsed="1"/>
+    <w:lsdException w:name="Table Web 1" w:semiHidden="1" w:unhideWhenUsed="1"/>
+    <w:lsdException w:name="Table Web 2" w:semiHidden="1" w:unhideWhenUsed="1"/>
+    <w:lsdException w:name="Table Web 3" w:semiHidden="1" w:unhideWhenUsed="1"/>
+    <w:lsdException w:name="Table Theme" w:semiHidden="1" w:unhideWhenUsed="1"/>
     <w:lsdException w:name="Placeholder Text" w:semiHidden="1" w:uiPriority="99"/>
     <w:lsdException w:name="No Spacing" w:uiPriority="1" w:qFormat="1"/>
     <w:lsdException w:name="Light Shading" w:uiPriority="60"/>

</xml_diff>